<commit_message>
Name GitReq instead of PURE as the future cross-dataset corpus
GitReq (arXiv:2606.21810) already labels security, functional
requirements and six more PROMISE_exp quality categories, so it needs no
new annotation. Reference [27] now cites it.

Co-Authored-By: Claude Opus 5.5 <noreply@anthropic.com>
Claude-Session: https://claude.ai/code/session_01YPT3EknqUvmSMeFqq245Uc
</commit_message>
<xml_diff>
--- a/paper/icci2026_word/ICCI2026_paper_clean.docx
+++ b/paper/icci2026_word/ICCI2026_paper_clean.docx
@@ -13078,7 +13078,7 @@
         <w:rPr>
           <w:b/>
         </w:rPr>
-        <w:t xml:space="preserve">Cross-dataset evaluation with PURE.</w:t>
+        <w:t xml:space="preserve">Cross-dataset evaluation with GitReq.</w:t>
       </w:r>
       <w:r>
         <w:t xml:space="preserve"> </w:t>
@@ -13105,94 +13105,94 @@
         <w:t xml:space="preserve">observed</w:t>
       </w:r>
       <w:r>
-        <w:t xml:space="preserve"> on one corpus pair, </w:t>
-      </w:r>
-      <w:r>
-        <w:t xml:space="preserve">the next step is </w:t>
-      </w:r>
-      <w:r>
-        <w:t xml:space="preserve">to annotate </w:t>
-      </w:r>
-      <w:r>
-        <w:t xml:space="preserve">a third</w:t>
-      </w:r>
-      <w:r>
-        <w:t xml:space="preserve"> source for the security task</w:t>
+        <w:t xml:space="preserve"> on one corpus pair,</w:t>
+      </w:r>
+      <w:r>
+        <w:t xml:space="preserve"> the next step is a third, independently annotated </w:t>
+      </w:r>
+      <w:r>
+        <w:t xml:space="preserve">corpus.</w:t>
+      </w:r>
+      <w:r>
+        <w:t xml:space="preserve"> </w:t>
+      </w:r>
+      <w:r>
+        <w:t xml:space="preserve">GitReq contains 6</w:t>
+      </w:r>
+      <w:r>
+        <w:t xml:space="preserve">,</w:t>
+      </w:r>
+      <w:r>
+        <w:t xml:space="preserve">302</w:t>
+      </w:r>
+      <w:r>
+        <w:t xml:space="preserve"> </w:t>
+      </w:r>
+      <w:r>
+        <w:t xml:space="preserve">expert-validated</w:t>
+      </w:r>
+      <w:r>
+        <w:t xml:space="preserve"> requirements </w:t>
+      </w:r>
+      <w:r>
+        <w:t xml:space="preserve">mined from 4,080 GitHub repositories</w:t>
+      </w:r>
+      <w:r>
+        <w:t xml:space="preserve"> [27]. It </w:t>
+      </w:r>
+      <w:r>
+        <w:t xml:space="preserve">includes functional requirements and seven quality categories that all occur in the PROMISE_exp taxonomy, security among them, so all three tasks could be evaluated across corpora on the shared labels. It </w:t>
+      </w:r>
+      <w:r>
+        <w:t xml:space="preserve">would </w:t>
+      </w:r>
+      <w:r>
+        <w:t xml:space="preserve">also</w:t>
+      </w:r>
+      <w:r>
+        <w:t xml:space="preserve"> allow the prevalence gap between training and test </w:t>
+      </w:r>
+      <w:r>
+        <w:t xml:space="preserve">corpora</w:t>
+      </w:r>
+      <w:r>
+        <w:t xml:space="preserve"> to be varied </w:t>
+      </w:r>
+      <w:r>
+        <w:t xml:space="preserve">systematically</w:t>
       </w:r>
       <w:r>
         <w:t xml:space="preserve">, </w:t>
       </w:r>
       <w:r>
-        <w:t xml:space="preserve">such</w:t>
-      </w:r>
-      <w:r>
-        <w:t xml:space="preserve"> </w:t>
-      </w:r>
-      <w:r>
-        <w:t xml:space="preserve">as</w:t>
-      </w:r>
-      <w:r>
-        <w:t xml:space="preserve"> PURE, a public collection of complete requirements documents [27]. </w:t>
-      </w:r>
-      <w:r>
-        <w:t xml:space="preserve">This</w:t>
-      </w:r>
-      <w:r>
-        <w:t xml:space="preserve"> would </w:t>
-      </w:r>
-      <w:r>
-        <w:t xml:space="preserve">provide</w:t>
-      </w:r>
-      <w:r>
-        <w:t xml:space="preserve"> </w:t>
-      </w:r>
-      <w:r>
-        <w:t xml:space="preserve">several</w:t>
-      </w:r>
-      <w:r>
-        <w:t xml:space="preserve"> cross-dataset </w:t>
-      </w:r>
-      <w:r>
-        <w:t xml:space="preserve">comparisons</w:t>
-      </w:r>
-      <w:r>
-        <w:t xml:space="preserve"> </w:t>
-      </w:r>
-      <w:r>
-        <w:t xml:space="preserve">instead</w:t>
-      </w:r>
-      <w:r>
-        <w:t xml:space="preserve"> </w:t>
-      </w:r>
-      <w:r>
-        <w:t xml:space="preserve">of one</w:t>
-      </w:r>
-      <w:r>
-        <w:t xml:space="preserve">, allow the prevalence gap between training and test </w:t>
-      </w:r>
-      <w:r>
-        <w:t xml:space="preserve">corpora</w:t>
-      </w:r>
-      <w:r>
-        <w:t xml:space="preserve"> to be varied </w:t>
-      </w:r>
-      <w:r>
-        <w:t xml:space="preserve">systematically</w:t>
-      </w:r>
-      <w:r>
-        <w:t xml:space="preserve">, and </w:t>
-      </w:r>
-      <w:r>
-        <w:t xml:space="preserve">add</w:t>
-      </w:r>
-      <w:r>
-        <w:t xml:space="preserve"> a corpus</w:t>
-      </w:r>
-      <w:r>
-        <w:t xml:space="preserve"> that is</w:t>
-      </w:r>
-      <w:r>
-        <w:t xml:space="preserve"> less likely to have been seen during pre-training.</w:t>
+        <w:t xml:space="preserve">on</w:t>
+      </w:r>
+      <w:r>
+        <w:t xml:space="preserve"> a </w:t>
+      </w:r>
+      <w:r>
+        <w:t xml:space="preserve">different</w:t>
+      </w:r>
+      <w:r>
+        <w:t xml:space="preserve"> </w:t>
+      </w:r>
+      <w:r>
+        <w:t xml:space="preserve">kind</w:t>
+      </w:r>
+      <w:r>
+        <w:t xml:space="preserve"> </w:t>
+      </w:r>
+      <w:r>
+        <w:t xml:space="preserve">of</w:t>
+      </w:r>
+      <w:r>
+        <w:t xml:space="preserve"> </w:t>
+      </w:r>
+      <w:r>
+        <w:t xml:space="preserve">text</w:t>
+      </w:r>
+      <w:r>
+        <w:t xml:space="preserve">.</w:t>
       </w:r>
     </w:p>
     <w:p>
@@ -13442,7 +13442,91 @@
         <w:pStyle w:val="references"/>
       </w:pPr>
       <w:r>
-        <w:t>A. Ferrari, G. O. Spagnolo, and S. Gnesi, “PURE: A dataset of public requirements documents,” in Proc. IEEE RE, 2017, pp. 502–505.</w:t>
+        <w:t xml:space="preserve">F</w:t>
+      </w:r>
+      <w:r>
+        <w:t xml:space="preserve">. </w:t>
+      </w:r>
+      <w:r>
+        <w:t xml:space="preserve">Kamal</w:t>
+      </w:r>
+      <w:r>
+        <w:t xml:space="preserve">, </w:t>
+      </w:r>
+      <w:r>
+        <w:t xml:space="preserve">M</w:t>
+      </w:r>
+      <w:r>
+        <w:t xml:space="preserve">. </w:t>
+      </w:r>
+      <w:r>
+        <w:t xml:space="preserve">H</w:t>
+      </w:r>
+      <w:r>
+        <w:t xml:space="preserve">. </w:t>
+      </w:r>
+      <w:r>
+        <w:t xml:space="preserve">Kabir</w:t>
+      </w:r>
+      <w:r>
+        <w:t xml:space="preserve">, and </w:t>
+      </w:r>
+      <w:r>
+        <w:t xml:space="preserve">M</w:t>
+      </w:r>
+      <w:r>
+        <w:t xml:space="preserve">. </w:t>
+      </w:r>
+      <w:r>
+        <w:t xml:space="preserve">R. Islam</w:t>
+      </w:r>
+      <w:r>
+        <w:t xml:space="preserve">, “</w:t>
+      </w:r>
+      <w:r>
+        <w:t xml:space="preserve">GitReq</w:t>
+      </w:r>
+      <w:r>
+        <w:t xml:space="preserve">: A </w:t>
+      </w:r>
+      <w:r>
+        <w:t xml:space="preserve">gold standard </w:t>
+      </w:r>
+      <w:r>
+        <w:t xml:space="preserve">dataset </w:t>
+      </w:r>
+      <w:r>
+        <w:t xml:space="preserve">for</w:t>
+      </w:r>
+      <w:r>
+        <w:t xml:space="preserve"> </w:t>
+      </w:r>
+      <w:r>
+        <w:t xml:space="preserve">software quality</w:t>
+      </w:r>
+      <w:r>
+        <w:t xml:space="preserve"> requirements</w:t>
+      </w:r>
+      <w:r>
+        <w:t xml:space="preserve">,” </w:t>
+      </w:r>
+      <w:r>
+        <w:t xml:space="preserve">arXiv:2606</w:t>
+      </w:r>
+      <w:r>
+        <w:t xml:space="preserve">.</w:t>
+      </w:r>
+      <w:r>
+        <w:t xml:space="preserve">21810</w:t>
+      </w:r>
+      <w:r>
+        <w:t xml:space="preserve">, </w:t>
+      </w:r>
+      <w:r>
+        <w:t xml:space="preserve">2026</w:t>
+      </w:r>
+      <w:r>
+        <w:t xml:space="preserve">.</w:t>
       </w:r>
     </w:p>
     <w:sectPr>

</xml_diff>

<commit_message>
Remove the acknowledgment section
Co-Authored-By: Claude Opus 5.5 <noreply@anthropic.com>
Claude-Session: https://claude.ai/code/session_01YPT3EknqUvmSMeFqq245Uc
</commit_message>
<xml_diff>
--- a/paper/icci2026_word/ICCI2026_paper_clean.docx
+++ b/paper/icci2026_word/ICCI2026_paper_clean.docx
@@ -13193,26 +13193,6 @@
       </w:r>
       <w:r>
         <w:t xml:space="preserve">.</w:t>
-      </w:r>
-    </w:p>
-    <w:p>
-      <w:pPr>
-        <w:pStyle w:val="Heading1"/>
-        <w:numPr>
-          <w:ilvl w:val="0"/>
-          <w:numId w:val="0"/>
-        </w:numPr>
-      </w:pPr>
-      <w:r>
-        <w:t xml:space="preserve">Acknowledgment</w:t>
-      </w:r>
-    </w:p>
-    <w:p>
-      <w:pPr>
-        <w:pStyle w:val="BodyText"/>
-      </w:pPr>
-      <w:r>
-        <w:t xml:space="preserve">Generative AI tools were used to assist in drafting and editing the text of this paper. The authors are responsible for the study design, the experiments and all reported results.</w:t>
       </w:r>
     </w:p>
     <w:p>

</xml_diff>

<commit_message>
State that the unweighted controls ran in-domain on PROMISE_exp only
Co-Authored-By: Claude Opus 5.5 <noreply@anthropic.com>
Claude-Session: https://claude.ai/code/session_01YPT3EknqUvmSMeFqq245Uc
</commit_message>
<xml_diff>
--- a/paper/icci2026_word/ICCI2026_paper_clean.docx
+++ b/paper/icci2026_word/ICCI2026_paper_clean.docx
@@ -4871,10 +4871,25 @@
         <w:t xml:space="preserve">,</w:t>
       </w:r>
       <w:r>
-        <w:t xml:space="preserve"> </w:t>
-      </w:r>
-      <w:r>
-        <w:t xml:space="preserve">at the in-domain and cross-dataset levels. Six instruction-tuned open models are run locally: Gemma-2-2B, SmolLM3-3B, Qwen2.5-3B, Phi-4-mini, Qwen2.5-7B and Llama-3.1-8B, </w:t>
+        <w:t xml:space="preserve"> in-domain </w:t>
+      </w:r>
+      <w:r>
+        <w:t xml:space="preserve">on PROMISE_exp </w:t>
+      </w:r>
+      <w:r>
+        <w:t xml:space="preserve">and</w:t>
+      </w:r>
+      <w:r>
+        <w:t xml:space="preserve"> at the</w:t>
+      </w:r>
+      <w:r>
+        <w:t xml:space="preserve"> cross-dataset </w:t>
+      </w:r>
+      <w:r>
+        <w:t xml:space="preserve">level</w:t>
+      </w:r>
+      <w:r>
+        <w:t xml:space="preserve">. Six instruction-tuned open models are run locally: Gemma-2-2B, SmolLM3-3B, Qwen2.5-3B, Phi-4-mini, Qwen2.5-7B and Llama-3.1-8B, </w:t>
       </w:r>
       <w:r>
         <w:t xml:space="preserve">with</w:t>
@@ -7420,7 +7435,25 @@
         <w:t xml:space="preserve">only </w:t>
       </w:r>
       <w:r>
-        <w:t xml:space="preserve">in-domain and cross-dataset </w:t>
+        <w:t xml:space="preserve">in-domain </w:t>
+      </w:r>
+      <w:r>
+        <w:t xml:space="preserve">on PROMISE_exp </w:t>
+      </w:r>
+      <w:r>
+        <w:t xml:space="preserve">and</w:t>
+      </w:r>
+      <w:r>
+        <w:t xml:space="preserve"> at the</w:t>
+      </w:r>
+      <w:r>
+        <w:t xml:space="preserve"> cross-dataset </w:t>
+      </w:r>
+      <w:r>
+        <w:t xml:space="preserve">level</w:t>
+      </w:r>
+      <w:r>
+        <w:t xml:space="preserve"> </w:t>
       </w:r>
       <w:r>
         <w:t xml:space="preserve">(hence</w:t>

</xml_diff>